<commit_message>
Word noviembre: encabezado sin la frase de firma
Co-Authored-By: Claude Opus 5.5 <noreply@anthropic.com>
Claude-Session: https://claude.ai/code/session_01VNNU832suxERsaZH8fFMyk
</commit_message>
<xml_diff>
--- a/clientes/ln415-travel/meses/2026-11_LN415_Noviembre.docx
+++ b/clientes/ln415-travel/meses/2026-11_LN415_Noviembre.docx
@@ -16,25 +16,7 @@
         <w:pStyle w:val="FirstParagraph"/>
       </w:pPr>
       <w:r>
-        <w:t xml:space="preserve">Guiones de reels y carruseles del mes, en orden de publicación. Firma:</w:t>
-      </w:r>
-      <w:r>
-        <w:t xml:space="preserve"> </w:t>
-      </w:r>
-      <w:r>
-        <w:t xml:space="preserve">“</w:t>
-      </w:r>
-      <w:r>
-        <w:t xml:space="preserve">Esto no lo habría armado así por mi cuenta.</w:t>
-      </w:r>
-      <w:r>
-        <w:t xml:space="preserve">”</w:t>
-      </w:r>
-      <w:r>
-        <w:t xml:space="preserve"> </w:t>
-      </w:r>
-      <w:r>
-        <w:t xml:space="preserve">· Palabras: VIAJE (directa) y RUTA (test en www.ln415.com/ruta).</w:t>
+        <w:t xml:space="preserve">Guiones de reels y carruseles del mes, en orden de publicación. Reels de 50–60 s · Palabras: VIAJE (directa) y RUTA (test en www.ln415.com/ruta).</w:t>
       </w:r>
     </w:p>
     <w:bookmarkStart w:id="20" w:name="calendario"/>

</xml_diff>